<commit_message>
Actualizar documentación y landing page para la entrega final de LINE
</commit_message>
<xml_diff>
--- a/documentacion/Documento_Enlaces_Entrega.docx
+++ b/documentacion/Documento_Enlaces_Entrega.docx
@@ -56,8 +56,13 @@
         <w:t>Agosto de 2026</w:t>
       </w:r>
     </w:p>
-    <w:p/>
     <w:p>
+      <w:pPr>
+        <w:rPr>
+          <w:i/>
+          <w:sz w:val="20"/>
+        </w:rPr>
+      </w:pPr>
       <w:r>
         <w:rPr>
           <w:i/>
@@ -72,7 +77,46 @@
           <w:b/>
           <w:sz w:val="32"/>
         </w:rPr>
-        <w:t>1. Repositorios de código (GitHub)</w:t>
+        <w:t>1</w:t>
+      </w:r>
+      <w:r>
+        <w:rPr>
+          <w:b/>
+          <w:sz w:val="32"/>
+        </w:rPr>
+        <w:t>. Landing interactiva del proyecto</w:t>
+      </w:r>
+    </w:p>
+    <w:p>
+      <w:pPr>
+        <w:pStyle w:val="Listaconvietas"/>
+      </w:pPr>
+      <w:r>
+        <w:t xml:space="preserve">Página pública del proyecto (workflow interactivo, métricas, documentación): </w:t>
+      </w:r>
+      <w:hyperlink r:id="rId6">
+        <w:r>
+          <w:rPr>
+            <w:u w:val="single"/>
+          </w:rPr>
+          <w:t>https://jaoliverosm.github.io/Capstone-/</w:t>
+        </w:r>
+      </w:hyperlink>
+    </w:p>
+    <w:p>
+      <w:r>
+        <w:rPr>
+          <w:b/>
+          <w:sz w:val="32"/>
+        </w:rPr>
+        <w:t>2</w:t>
+      </w:r>
+      <w:r>
+        <w:rPr>
+          <w:b/>
+          <w:sz w:val="32"/>
+        </w:rPr>
+        <w:t>. Repositorios de código (GitHub)</w:t>
       </w:r>
     </w:p>
     <w:p>
@@ -82,7 +126,7 @@
       <w:r>
         <w:t xml:space="preserve">Código de la aplicación LINE (backend FastAPI, frontend, modelos): </w:t>
       </w:r>
-      <w:hyperlink r:id="rId6">
+      <w:hyperlink r:id="rId7">
         <w:r>
           <w:rPr>
             <w:u w:val="single"/>
@@ -98,37 +142,12 @@
       <w:r>
         <w:t xml:space="preserve">Proyecto completo Capstone (notebooks, modelos, datasets sintéticos, informes): </w:t>
       </w:r>
-      <w:hyperlink r:id="rId7">
+      <w:hyperlink r:id="rId8">
         <w:r>
           <w:rPr>
             <w:u w:val="single"/>
           </w:rPr>
           <w:t>https://github.com/jaoliverosm/Capstone-</w:t>
-        </w:r>
-      </w:hyperlink>
-    </w:p>
-    <w:p>
-      <w:r>
-        <w:rPr>
-          <w:b/>
-          <w:sz w:val="32"/>
-        </w:rPr>
-        <w:t>2. Landing interactiva del proyecto</w:t>
-      </w:r>
-    </w:p>
-    <w:p>
-      <w:pPr>
-        <w:pStyle w:val="Listaconvietas"/>
-      </w:pPr>
-      <w:r>
-        <w:t xml:space="preserve">Página pública del proyecto (workflow interactivo, métricas, documentación): </w:t>
-      </w:r>
-      <w:hyperlink r:id="rId8">
-        <w:r>
-          <w:rPr>
-            <w:u w:val="single"/>
-          </w:rPr>
-          <w:t>https://jaoliverosm.github.io/Capstone-/</w:t>
         </w:r>
       </w:hyperlink>
     </w:p>
@@ -196,12 +215,20 @@
       </w:r>
     </w:p>
     <w:p>
-      <w:r>
+      <w:pPr>
         <w:rPr>
           <w:i/>
         </w:rPr>
-        <w:t>[ENLACE PENDIENTE — el video pitch (máximo 3 minutos) se publicará con acceso público antes del cierre de la plataforma]</w:t>
-      </w:r>
+      </w:pPr>
+      <w:hyperlink r:id="rId10" w:history="1">
+        <w:r>
+          <w:rPr>
+            <w:rStyle w:val="Hipervnculo"/>
+            <w:i/>
+          </w:rPr>
+          <w:t>https://youtu.be/IPlLKLVTk5w</w:t>
+        </w:r>
+      </w:hyperlink>
     </w:p>
     <w:p>
       <w:r>
@@ -233,7 +260,6 @@
         <w:rPr>
           <w:b/>
         </w:rPr>
-        <w:lastRenderedPageBreak/>
         <w:t>2. Jazmine Alexandra Acosta Bejarano</w:t>
       </w:r>
     </w:p>
@@ -250,6 +276,7 @@
         <w:rPr>
           <w:b/>
         </w:rPr>
+        <w:lastRenderedPageBreak/>
         <w:t>3. Isabella Andrea Cuesta Niebles</w:t>
       </w:r>
     </w:p>
@@ -458,7 +485,7 @@
   <w:abstractNum w:abstractNumId="8" w15:restartNumberingAfterBreak="0">
     <w:nsid w:val="FFFFFF89"/>
     <w:multiLevelType w:val="singleLevel"/>
-    <w:tmpl w:val="29761A62"/>
+    <w:tmpl w:val="8102B46A"/>
     <w:lvl w:ilvl="0">
       <w:start w:val="1"/>
       <w:numFmt w:val="bullet"/>
@@ -1112,6 +1139,7 @@
   <w:style w:type="character" w:default="1" w:styleId="Fuentedeprrafopredeter">
     <w:name w:val="Default Paragraph Font"/>
     <w:uiPriority w:val="1"/>
+    <w:semiHidden/>
     <w:unhideWhenUsed/>
   </w:style>
   <w:style w:type="table" w:default="1" w:styleId="Tablanormal">

</xml_diff>